<commit_message>
Workshop 3: add VS Code terminal screenshots for every exercise
</commit_message>
<xml_diff>
--- a/JavaProjects/Week03-Workshop3/doc/BIT235_Workshop3_S1580887.docx
+++ b/JavaProjects/Week03-Workshop3/doc/BIT235_Workshop3_S1580887.docx
@@ -1218,6 +1218,70 @@
     </w:p>
     <w:p>
       <w:pPr>
+        <w:pStyle w:val="NoSpacing"/>
+        <w:spacing w:before="0" w:after="0" w:line="240" w:lineRule="auto"/>
+        <w:ind w:left="0" w:firstLine="0"/>
+      </w:pPr>
+    </w:p>
+    <w:p>
+      <w:pPr>
+        <w:pStyle w:val="NoSpacing"/>
+        <w:spacing w:before="60" w:after="40" w:line="240" w:lineRule="auto"/>
+        <w:ind w:left="0" w:firstLine="0"/>
+      </w:pPr>
+      <w:r>
+        <w:rPr>
+          <w:rFonts w:ascii="Calibri" w:hAnsi="Calibri" w:cs="Calibri" w:eastAsia="Calibri"/>
+          <w:b/>
+          <w:sz w:val="18"/>
+        </w:rPr>
+        <w:t>VS Code - run in the integrated terminal (see the command and its output):</w:t>
+      </w:r>
+    </w:p>
+    <w:p>
+      <w:pPr>
+        <w:pStyle w:val="NoSpacing"/>
+        <w:spacing w:before="0" w:after="0" w:line="240" w:lineRule="auto"/>
+        <w:ind w:left="0" w:firstLine="0"/>
+        <w:jc w:val="left"/>
+      </w:pPr>
+      <w:r>
+        <w:drawing>
+          <wp:inline xmlns:a="http://schemas.openxmlformats.org/drawingml/2006/main" xmlns:pic="http://schemas.openxmlformats.org/drawingml/2006/picture">
+            <wp:extent cx="5806440" cy="2903220"/>
+            <wp:docPr id="1376574522" name="Picture 1376574522"/>
+            <wp:cNvGraphicFramePr>
+              <a:graphicFrameLocks noChangeAspect="1"/>
+            </wp:cNvGraphicFramePr>
+            <a:graphic>
+              <a:graphicData uri="http://schemas.openxmlformats.org/drawingml/2006/picture">
+                <pic:pic>
+                  <pic:nvPicPr>
+                    <pic:cNvPr id="0" name="01_WelcomeMessage.png"/>
+                    <pic:cNvPicPr/>
+                  </pic:nvPicPr>
+                  <pic:blipFill>
+                    <a:blip r:embed="rId12"/>
+                    <a:stretch>
+                      <a:fillRect/>
+                    </a:stretch>
+                  </pic:blipFill>
+                  <pic:spPr>
+                    <a:xfrm>
+                      <a:off x="0" y="0"/>
+                      <a:ext cx="5806440" cy="2903220"/>
+                    </a:xfrm>
+                    <a:prstGeom prst="rect"/>
+                  </pic:spPr>
+                </pic:pic>
+              </a:graphicData>
+            </a:graphic>
+          </wp:inline>
+        </w:drawing>
+      </w:r>
+    </w:p>
+    <w:p>
+      <w:pPr>
         <w:rPr>
           <w:rFonts w:ascii="Times New Roman" w:hAnsi="Times New Roman" w:cs="Times New Roman"/>
           <w:b/>
@@ -1798,7 +1862,7 @@
           <w:b/>
           <w:sz w:val="19"/>
         </w:rPr>
-        <w:t>Output (Racecar):</w:t>
+        <w:t>Output (input: Racecar):</w:t>
       </w:r>
     </w:p>
     <w:p>
@@ -1865,7 +1929,7 @@
           <w:b/>
           <w:sz w:val="19"/>
         </w:rPr>
-        <w:t>Output (hello):</w:t>
+        <w:t>Output (input: hello):</w:t>
       </w:r>
     </w:p>
     <w:p>
@@ -1911,6 +1975,70 @@
           <w:sz w:val="14"/>
         </w:rPr>
         <w:t>Result        : "hello" is NOT a palindrome.</w:t>
+      </w:r>
+    </w:p>
+    <w:p>
+      <w:pPr>
+        <w:pStyle w:val="NoSpacing"/>
+        <w:spacing w:before="0" w:after="0" w:line="240" w:lineRule="auto"/>
+        <w:ind w:left="0" w:firstLine="0"/>
+      </w:pPr>
+    </w:p>
+    <w:p>
+      <w:pPr>
+        <w:pStyle w:val="NoSpacing"/>
+        <w:spacing w:before="60" w:after="40" w:line="240" w:lineRule="auto"/>
+        <w:ind w:left="0" w:firstLine="0"/>
+      </w:pPr>
+      <w:r>
+        <w:rPr>
+          <w:rFonts w:ascii="Calibri" w:hAnsi="Calibri" w:cs="Calibri" w:eastAsia="Calibri"/>
+          <w:b/>
+          <w:sz w:val="18"/>
+        </w:rPr>
+        <w:t>VS Code - run in the integrated terminal (see the command and its output):</w:t>
+      </w:r>
+    </w:p>
+    <w:p>
+      <w:pPr>
+        <w:pStyle w:val="NoSpacing"/>
+        <w:spacing w:before="0" w:after="0" w:line="240" w:lineRule="auto"/>
+        <w:ind w:left="0" w:firstLine="0"/>
+        <w:jc w:val="left"/>
+      </w:pPr>
+      <w:r>
+        <w:drawing>
+          <wp:inline xmlns:a="http://schemas.openxmlformats.org/drawingml/2006/main" xmlns:pic="http://schemas.openxmlformats.org/drawingml/2006/picture">
+            <wp:extent cx="5806440" cy="2903220"/>
+            <wp:docPr id="1376574523" name="Picture 1376574523"/>
+            <wp:cNvGraphicFramePr>
+              <a:graphicFrameLocks noChangeAspect="1"/>
+            </wp:cNvGraphicFramePr>
+            <a:graphic>
+              <a:graphicData uri="http://schemas.openxmlformats.org/drawingml/2006/picture">
+                <pic:pic>
+                  <pic:nvPicPr>
+                    <pic:cNvPr id="0" name="02_PalindromeCheck.png"/>
+                    <pic:cNvPicPr/>
+                  </pic:nvPicPr>
+                  <pic:blipFill>
+                    <a:blip r:embed="rId13"/>
+                    <a:stretch>
+                      <a:fillRect/>
+                    </a:stretch>
+                  </pic:blipFill>
+                  <pic:spPr>
+                    <a:xfrm>
+                      <a:off x="0" y="0"/>
+                      <a:ext cx="5806440" cy="2903220"/>
+                    </a:xfrm>
+                    <a:prstGeom prst="rect"/>
+                  </pic:spPr>
+                </pic:pic>
+              </a:graphicData>
+            </a:graphic>
+          </wp:inline>
+        </w:drawing>
       </w:r>
     </w:p>
     <w:p>
@@ -3328,6 +3456,70 @@
     </w:p>
     <w:p>
       <w:pPr>
+        <w:pStyle w:val="NoSpacing"/>
+        <w:spacing w:before="0" w:after="0" w:line="240" w:lineRule="auto"/>
+        <w:ind w:left="0" w:firstLine="0"/>
+      </w:pPr>
+    </w:p>
+    <w:p>
+      <w:pPr>
+        <w:pStyle w:val="NoSpacing"/>
+        <w:spacing w:before="60" w:after="40" w:line="240" w:lineRule="auto"/>
+        <w:ind w:left="0" w:firstLine="0"/>
+      </w:pPr>
+      <w:r>
+        <w:rPr>
+          <w:rFonts w:ascii="Calibri" w:hAnsi="Calibri" w:cs="Calibri" w:eastAsia="Calibri"/>
+          <w:b/>
+          <w:sz w:val="18"/>
+        </w:rPr>
+        <w:t>VS Code - run in the integrated terminal (see the command and its output):</w:t>
+      </w:r>
+    </w:p>
+    <w:p>
+      <w:pPr>
+        <w:pStyle w:val="NoSpacing"/>
+        <w:spacing w:before="0" w:after="0" w:line="240" w:lineRule="auto"/>
+        <w:ind w:left="0" w:firstLine="0"/>
+        <w:jc w:val="left"/>
+      </w:pPr>
+      <w:r>
+        <w:drawing>
+          <wp:inline xmlns:a="http://schemas.openxmlformats.org/drawingml/2006/main" xmlns:pic="http://schemas.openxmlformats.org/drawingml/2006/picture">
+            <wp:extent cx="5806440" cy="2903220"/>
+            <wp:docPr id="1376574524" name="Picture 1376574524"/>
+            <wp:cNvGraphicFramePr>
+              <a:graphicFrameLocks noChangeAspect="1"/>
+            </wp:cNvGraphicFramePr>
+            <a:graphic>
+              <a:graphicData uri="http://schemas.openxmlformats.org/drawingml/2006/picture">
+                <pic:pic>
+                  <pic:nvPicPr>
+                    <pic:cNvPr id="0" name="03_NationalDebt.png"/>
+                    <pic:cNvPicPr/>
+                  </pic:nvPicPr>
+                  <pic:blipFill>
+                    <a:blip r:embed="rId14"/>
+                    <a:stretch>
+                      <a:fillRect/>
+                    </a:stretch>
+                  </pic:blipFill>
+                  <pic:spPr>
+                    <a:xfrm>
+                      <a:off x="0" y="0"/>
+                      <a:ext cx="5806440" cy="2903220"/>
+                    </a:xfrm>
+                    <a:prstGeom prst="rect"/>
+                  </pic:spPr>
+                </pic:pic>
+              </a:graphicData>
+            </a:graphic>
+          </wp:inline>
+        </w:drawing>
+      </w:r>
+    </w:p>
+    <w:p>
+      <w:pPr>
         <w:spacing w:before="80" w:after="80"/>
         <w:rPr>
           <w:rFonts w:ascii="Times New Roman" w:hAnsi="Times New Roman" w:cs="Times New Roman"/>
@@ -4807,6 +4999,70 @@
     </w:p>
     <w:p>
       <w:pPr>
+        <w:pStyle w:val="NoSpacing"/>
+        <w:spacing w:before="0" w:after="0" w:line="240" w:lineRule="auto"/>
+        <w:ind w:left="0" w:firstLine="0"/>
+      </w:pPr>
+    </w:p>
+    <w:p>
+      <w:pPr>
+        <w:pStyle w:val="NoSpacing"/>
+        <w:spacing w:before="60" w:after="40" w:line="240" w:lineRule="auto"/>
+        <w:ind w:left="0" w:firstLine="0"/>
+      </w:pPr>
+      <w:r>
+        <w:rPr>
+          <w:rFonts w:ascii="Calibri" w:hAnsi="Calibri" w:cs="Calibri" w:eastAsia="Calibri"/>
+          <w:b/>
+          <w:sz w:val="18"/>
+        </w:rPr>
+        <w:t>VS Code - run in the integrated terminal (see the command and its output):</w:t>
+      </w:r>
+    </w:p>
+    <w:p>
+      <w:pPr>
+        <w:pStyle w:val="NoSpacing"/>
+        <w:spacing w:before="0" w:after="0" w:line="240" w:lineRule="auto"/>
+        <w:ind w:left="0" w:firstLine="0"/>
+        <w:jc w:val="left"/>
+      </w:pPr>
+      <w:r>
+        <w:drawing>
+          <wp:inline xmlns:a="http://schemas.openxmlformats.org/drawingml/2006/main" xmlns:pic="http://schemas.openxmlformats.org/drawingml/2006/picture">
+            <wp:extent cx="5806440" cy="2903220"/>
+            <wp:docPr id="1376574525" name="Picture 1376574525"/>
+            <wp:cNvGraphicFramePr>
+              <a:graphicFrameLocks noChangeAspect="1"/>
+            </wp:cNvGraphicFramePr>
+            <a:graphic>
+              <a:graphicData uri="http://schemas.openxmlformats.org/drawingml/2006/picture">
+                <pic:pic>
+                  <pic:nvPicPr>
+                    <pic:cNvPr id="0" name="04_CastingPrecision.png"/>
+                    <pic:cNvPicPr/>
+                  </pic:nvPicPr>
+                  <pic:blipFill>
+                    <a:blip r:embed="rId15"/>
+                    <a:stretch>
+                      <a:fillRect/>
+                    </a:stretch>
+                  </pic:blipFill>
+                  <pic:spPr>
+                    <a:xfrm>
+                      <a:off x="0" y="0"/>
+                      <a:ext cx="5806440" cy="2903220"/>
+                    </a:xfrm>
+                    <a:prstGeom prst="rect"/>
+                  </pic:spPr>
+                </pic:pic>
+              </a:graphicData>
+            </a:graphic>
+          </wp:inline>
+        </w:drawing>
+      </w:r>
+    </w:p>
+    <w:p>
+      <w:pPr>
         <w:spacing w:before="120"/>
         <w:rPr>
           <w:rFonts w:ascii="Times New Roman" w:hAnsi="Times New Roman" w:cs="Times New Roman"/>
@@ -5356,6 +5612,70 @@
     </w:p>
     <w:p>
       <w:pPr>
+        <w:pStyle w:val="NoSpacing"/>
+        <w:spacing w:before="0" w:after="0" w:line="240" w:lineRule="auto"/>
+        <w:ind w:left="0" w:firstLine="0"/>
+      </w:pPr>
+    </w:p>
+    <w:p>
+      <w:pPr>
+        <w:pStyle w:val="NoSpacing"/>
+        <w:spacing w:before="60" w:after="40" w:line="240" w:lineRule="auto"/>
+        <w:ind w:left="0" w:firstLine="0"/>
+      </w:pPr>
+      <w:r>
+        <w:rPr>
+          <w:rFonts w:ascii="Calibri" w:hAnsi="Calibri" w:cs="Calibri" w:eastAsia="Calibri"/>
+          <w:b/>
+          <w:sz w:val="18"/>
+        </w:rPr>
+        <w:t>VS Code - run in the integrated terminal (see the command and its output):</w:t>
+      </w:r>
+    </w:p>
+    <w:p>
+      <w:pPr>
+        <w:pStyle w:val="NoSpacing"/>
+        <w:spacing w:before="0" w:after="0" w:line="240" w:lineRule="auto"/>
+        <w:ind w:left="0" w:firstLine="0"/>
+        <w:jc w:val="left"/>
+      </w:pPr>
+      <w:r>
+        <w:drawing>
+          <wp:inline xmlns:a="http://schemas.openxmlformats.org/drawingml/2006/main" xmlns:pic="http://schemas.openxmlformats.org/drawingml/2006/picture">
+            <wp:extent cx="5806440" cy="2903220"/>
+            <wp:docPr id="1376574526" name="Picture 1376574526"/>
+            <wp:cNvGraphicFramePr>
+              <a:graphicFrameLocks noChangeAspect="1"/>
+            </wp:cNvGraphicFramePr>
+            <a:graphic>
+              <a:graphicData uri="http://schemas.openxmlformats.org/drawingml/2006/picture">
+                <pic:pic>
+                  <pic:nvPicPr>
+                    <pic:cNvPr id="0" name="05_AgeStringToInt.png"/>
+                    <pic:cNvPicPr/>
+                  </pic:nvPicPr>
+                  <pic:blipFill>
+                    <a:blip r:embed="rId16"/>
+                    <a:stretch>
+                      <a:fillRect/>
+                    </a:stretch>
+                  </pic:blipFill>
+                  <pic:spPr>
+                    <a:xfrm>
+                      <a:off x="0" y="0"/>
+                      <a:ext cx="5806440" cy="2903220"/>
+                    </a:xfrm>
+                    <a:prstGeom prst="rect"/>
+                  </pic:spPr>
+                </pic:pic>
+              </a:graphicData>
+            </a:graphic>
+          </wp:inline>
+        </w:drawing>
+      </w:r>
+    </w:p>
+    <w:p>
+      <w:pPr>
         <w:rPr>
           <w:rFonts w:ascii="Times New Roman" w:hAnsi="Times New Roman" w:cs="Times New Roman"/>
         </w:rPr>
@@ -6122,6 +6442,70 @@
           <w:sz w:val="14"/>
         </w:rPr>
         <w:t>String.valueOf(inactive)      : false</w:t>
+      </w:r>
+    </w:p>
+    <w:p>
+      <w:pPr>
+        <w:pStyle w:val="NoSpacing"/>
+        <w:spacing w:before="0" w:after="0" w:line="240" w:lineRule="auto"/>
+        <w:ind w:left="0" w:firstLine="0"/>
+      </w:pPr>
+    </w:p>
+    <w:p>
+      <w:pPr>
+        <w:pStyle w:val="NoSpacing"/>
+        <w:spacing w:before="60" w:after="40" w:line="240" w:lineRule="auto"/>
+        <w:ind w:left="0" w:firstLine="0"/>
+      </w:pPr>
+      <w:r>
+        <w:rPr>
+          <w:rFonts w:ascii="Calibri" w:hAnsi="Calibri" w:cs="Calibri" w:eastAsia="Calibri"/>
+          <w:b/>
+          <w:sz w:val="18"/>
+        </w:rPr>
+        <w:t>VS Code - run in the integrated terminal (see the command and its output):</w:t>
+      </w:r>
+    </w:p>
+    <w:p>
+      <w:pPr>
+        <w:pStyle w:val="NoSpacing"/>
+        <w:spacing w:before="0" w:after="0" w:line="240" w:lineRule="auto"/>
+        <w:ind w:left="0" w:firstLine="0"/>
+        <w:jc w:val="left"/>
+      </w:pPr>
+      <w:r>
+        <w:drawing>
+          <wp:inline xmlns:a="http://schemas.openxmlformats.org/drawingml/2006/main" xmlns:pic="http://schemas.openxmlformats.org/drawingml/2006/picture">
+            <wp:extent cx="5806440" cy="2903220"/>
+            <wp:docPr id="1376574527" name="Picture 1376574527"/>
+            <wp:cNvGraphicFramePr>
+              <a:graphicFrameLocks noChangeAspect="1"/>
+            </wp:cNvGraphicFramePr>
+            <a:graphic>
+              <a:graphicData uri="http://schemas.openxmlformats.org/drawingml/2006/picture">
+                <pic:pic>
+                  <pic:nvPicPr>
+                    <pic:cNvPr id="0" name="06_BooleanToString.png"/>
+                    <pic:cNvPicPr/>
+                  </pic:nvPicPr>
+                  <pic:blipFill>
+                    <a:blip r:embed="rId17"/>
+                    <a:stretch>
+                      <a:fillRect/>
+                    </a:stretch>
+                  </pic:blipFill>
+                  <pic:spPr>
+                    <a:xfrm>
+                      <a:off x="0" y="0"/>
+                      <a:ext cx="5806440" cy="2903220"/>
+                    </a:xfrm>
+                    <a:prstGeom prst="rect"/>
+                  </pic:spPr>
+                </pic:pic>
+              </a:graphicData>
+            </a:graphic>
+          </wp:inline>
+        </w:drawing>
       </w:r>
     </w:p>
     <w:p>
@@ -6695,7 +7079,71 @@
     <w:p>
       <w:pPr>
         <w:pStyle w:val="NoSpacing"/>
-        <w:spacing w:before="160" w:after="40" w:line="240" w:lineRule="auto"/>
+        <w:spacing w:before="0" w:after="0" w:line="240" w:lineRule="auto"/>
+        <w:ind w:left="0" w:firstLine="0"/>
+      </w:pPr>
+    </w:p>
+    <w:p>
+      <w:pPr>
+        <w:pStyle w:val="NoSpacing"/>
+        <w:spacing w:before="60" w:after="40" w:line="240" w:lineRule="auto"/>
+        <w:ind w:left="0" w:firstLine="0"/>
+      </w:pPr>
+      <w:r>
+        <w:rPr>
+          <w:rFonts w:ascii="Calibri" w:hAnsi="Calibri" w:cs="Calibri" w:eastAsia="Calibri"/>
+          <w:b/>
+          <w:sz w:val="18"/>
+        </w:rPr>
+        <w:t>VS Code - run in the integrated terminal (see the command and its output):</w:t>
+      </w:r>
+    </w:p>
+    <w:p>
+      <w:pPr>
+        <w:pStyle w:val="NoSpacing"/>
+        <w:spacing w:before="0" w:after="0" w:line="240" w:lineRule="auto"/>
+        <w:ind w:left="0" w:firstLine="0"/>
+        <w:jc w:val="left"/>
+      </w:pPr>
+      <w:r>
+        <w:drawing>
+          <wp:inline xmlns:a="http://schemas.openxmlformats.org/drawingml/2006/main" xmlns:pic="http://schemas.openxmlformats.org/drawingml/2006/picture">
+            <wp:extent cx="5806440" cy="2903220"/>
+            <wp:docPr id="1376574528" name="Picture 1376574528"/>
+            <wp:cNvGraphicFramePr>
+              <a:graphicFrameLocks noChangeAspect="1"/>
+            </wp:cNvGraphicFramePr>
+            <a:graphic>
+              <a:graphicData uri="http://schemas.openxmlformats.org/drawingml/2006/picture">
+                <pic:pic>
+                  <pic:nvPicPr>
+                    <pic:cNvPr id="0" name="07_GreetingByTime.png"/>
+                    <pic:cNvPicPr/>
+                  </pic:nvPicPr>
+                  <pic:blipFill>
+                    <a:blip r:embed="rId18"/>
+                    <a:stretch>
+                      <a:fillRect/>
+                    </a:stretch>
+                  </pic:blipFill>
+                  <pic:spPr>
+                    <a:xfrm>
+                      <a:off x="0" y="0"/>
+                      <a:ext cx="5806440" cy="2903220"/>
+                    </a:xfrm>
+                    <a:prstGeom prst="rect"/>
+                  </pic:spPr>
+                </pic:pic>
+              </a:graphicData>
+            </a:graphic>
+          </wp:inline>
+        </w:drawing>
+      </w:r>
+    </w:p>
+    <w:p>
+      <w:pPr>
+        <w:pStyle w:val="NoSpacing"/>
+        <w:spacing w:before="40" w:after="40" w:line="240" w:lineRule="auto"/>
         <w:ind w:left="0" w:firstLine="0"/>
       </w:pPr>
       <w:r>
@@ -7008,7 +7456,71 @@
     <w:p>
       <w:pPr>
         <w:pStyle w:val="NoSpacing"/>
-        <w:spacing w:before="160" w:after="40" w:line="240" w:lineRule="auto"/>
+        <w:spacing w:before="0" w:after="0" w:line="240" w:lineRule="auto"/>
+        <w:ind w:left="0" w:firstLine="0"/>
+      </w:pPr>
+    </w:p>
+    <w:p>
+      <w:pPr>
+        <w:pStyle w:val="NoSpacing"/>
+        <w:spacing w:before="60" w:after="40" w:line="240" w:lineRule="auto"/>
+        <w:ind w:left="0" w:firstLine="0"/>
+      </w:pPr>
+      <w:r>
+        <w:rPr>
+          <w:rFonts w:ascii="Calibri" w:hAnsi="Calibri" w:cs="Calibri" w:eastAsia="Calibri"/>
+          <w:b/>
+          <w:sz w:val="18"/>
+        </w:rPr>
+        <w:t>VS Code - run in the integrated terminal (see the command and its output):</w:t>
+      </w:r>
+    </w:p>
+    <w:p>
+      <w:pPr>
+        <w:pStyle w:val="NoSpacing"/>
+        <w:spacing w:before="0" w:after="0" w:line="240" w:lineRule="auto"/>
+        <w:ind w:left="0" w:firstLine="0"/>
+        <w:jc w:val="left"/>
+      </w:pPr>
+      <w:r>
+        <w:drawing>
+          <wp:inline xmlns:a="http://schemas.openxmlformats.org/drawingml/2006/main" xmlns:pic="http://schemas.openxmlformats.org/drawingml/2006/picture">
+            <wp:extent cx="5806440" cy="2903220"/>
+            <wp:docPr id="1376574529" name="Picture 1376574529"/>
+            <wp:cNvGraphicFramePr>
+              <a:graphicFrameLocks noChangeAspect="1"/>
+            </wp:cNvGraphicFramePr>
+            <a:graphic>
+              <a:graphicData uri="http://schemas.openxmlformats.org/drawingml/2006/picture">
+                <pic:pic>
+                  <pic:nvPicPr>
+                    <pic:cNvPr id="0" name="08_MultiplesOfFive.png"/>
+                    <pic:cNvPicPr/>
+                  </pic:nvPicPr>
+                  <pic:blipFill>
+                    <a:blip r:embed="rId19"/>
+                    <a:stretch>
+                      <a:fillRect/>
+                    </a:stretch>
+                  </pic:blipFill>
+                  <pic:spPr>
+                    <a:xfrm>
+                      <a:off x="0" y="0"/>
+                      <a:ext cx="5806440" cy="2903220"/>
+                    </a:xfrm>
+                    <a:prstGeom prst="rect"/>
+                  </pic:spPr>
+                </pic:pic>
+              </a:graphicData>
+            </a:graphic>
+          </wp:inline>
+        </w:drawing>
+      </w:r>
+    </w:p>
+    <w:p>
+      <w:pPr>
+        <w:pStyle w:val="NoSpacing"/>
+        <w:spacing w:before="40" w:after="40" w:line="240" w:lineRule="auto"/>
         <w:ind w:left="0" w:firstLine="0"/>
       </w:pPr>
       <w:r>
@@ -7298,6 +7810,70 @@
     </w:p>
     <w:p>
       <w:pPr>
+        <w:pStyle w:val="NoSpacing"/>
+        <w:spacing w:before="0" w:after="0" w:line="240" w:lineRule="auto"/>
+        <w:ind w:left="0" w:firstLine="0"/>
+      </w:pPr>
+    </w:p>
+    <w:p>
+      <w:pPr>
+        <w:pStyle w:val="NoSpacing"/>
+        <w:spacing w:before="60" w:after="40" w:line="240" w:lineRule="auto"/>
+        <w:ind w:left="0" w:firstLine="0"/>
+      </w:pPr>
+      <w:r>
+        <w:rPr>
+          <w:rFonts w:ascii="Calibri" w:hAnsi="Calibri" w:cs="Calibri" w:eastAsia="Calibri"/>
+          <w:b/>
+          <w:sz w:val="18"/>
+        </w:rPr>
+        <w:t>VS Code - run in the integrated terminal (see the command and its output):</w:t>
+      </w:r>
+    </w:p>
+    <w:p>
+      <w:pPr>
+        <w:pStyle w:val="NoSpacing"/>
+        <w:spacing w:before="0" w:after="0" w:line="240" w:lineRule="auto"/>
+        <w:ind w:left="0" w:firstLine="0"/>
+        <w:jc w:val="left"/>
+      </w:pPr>
+      <w:r>
+        <w:drawing>
+          <wp:inline xmlns:a="http://schemas.openxmlformats.org/drawingml/2006/main" xmlns:pic="http://schemas.openxmlformats.org/drawingml/2006/picture">
+            <wp:extent cx="5806440" cy="2903220"/>
+            <wp:docPr id="1376574530" name="Picture 1376574530"/>
+            <wp:cNvGraphicFramePr>
+              <a:graphicFrameLocks noChangeAspect="1"/>
+            </wp:cNvGraphicFramePr>
+            <a:graphic>
+              <a:graphicData uri="http://schemas.openxmlformats.org/drawingml/2006/picture">
+                <pic:pic>
+                  <pic:nvPicPr>
+                    <pic:cNvPr id="0" name="09_SumOneToTen.png"/>
+                    <pic:cNvPicPr/>
+                  </pic:nvPicPr>
+                  <pic:blipFill>
+                    <a:blip r:embed="rId20"/>
+                    <a:stretch>
+                      <a:fillRect/>
+                    </a:stretch>
+                  </pic:blipFill>
+                  <pic:spPr>
+                    <a:xfrm>
+                      <a:off x="0" y="0"/>
+                      <a:ext cx="5806440" cy="2903220"/>
+                    </a:xfrm>
+                    <a:prstGeom prst="rect"/>
+                  </pic:spPr>
+                </pic:pic>
+              </a:graphicData>
+            </a:graphic>
+          </wp:inline>
+        </w:drawing>
+      </w:r>
+    </w:p>
+    <w:p>
+      <w:pPr>
         <w:rPr>
           <w:rFonts w:ascii="Times New Roman" w:hAnsi="Times New Roman" w:cs="Times New Roman"/>
         </w:rPr>
@@ -8095,6 +8671,70 @@
     </w:p>
     <w:p>
       <w:pPr>
+        <w:pStyle w:val="NoSpacing"/>
+        <w:spacing w:before="0" w:after="0" w:line="240" w:lineRule="auto"/>
+        <w:ind w:left="0" w:firstLine="0"/>
+      </w:pPr>
+    </w:p>
+    <w:p>
+      <w:pPr>
+        <w:pStyle w:val="NoSpacing"/>
+        <w:spacing w:before="60" w:after="40" w:line="240" w:lineRule="auto"/>
+        <w:ind w:left="0" w:firstLine="0"/>
+      </w:pPr>
+      <w:r>
+        <w:rPr>
+          <w:rFonts w:ascii="Calibri" w:hAnsi="Calibri" w:cs="Calibri" w:eastAsia="Calibri"/>
+          <w:b/>
+          <w:sz w:val="18"/>
+        </w:rPr>
+        <w:t>VS Code - run in the integrated terminal (see the command and its output):</w:t>
+      </w:r>
+    </w:p>
+    <w:p>
+      <w:pPr>
+        <w:pStyle w:val="NoSpacing"/>
+        <w:spacing w:before="0" w:after="0" w:line="240" w:lineRule="auto"/>
+        <w:ind w:left="0" w:firstLine="0"/>
+        <w:jc w:val="left"/>
+      </w:pPr>
+      <w:r>
+        <w:drawing>
+          <wp:inline xmlns:a="http://schemas.openxmlformats.org/drawingml/2006/main" xmlns:pic="http://schemas.openxmlformats.org/drawingml/2006/picture">
+            <wp:extent cx="5806440" cy="2903220"/>
+            <wp:docPr id="1376574531" name="Picture 1376574531"/>
+            <wp:cNvGraphicFramePr>
+              <a:graphicFrameLocks noChangeAspect="1"/>
+            </wp:cNvGraphicFramePr>
+            <a:graphic>
+              <a:graphicData uri="http://schemas.openxmlformats.org/drawingml/2006/picture">
+                <pic:pic>
+                  <pic:nvPicPr>
+                    <pic:cNvPr id="0" name="10_SmallestOfThree.png"/>
+                    <pic:cNvPicPr/>
+                  </pic:nvPicPr>
+                  <pic:blipFill>
+                    <a:blip r:embed="rId21"/>
+                    <a:stretch>
+                      <a:fillRect/>
+                    </a:stretch>
+                  </pic:blipFill>
+                  <pic:spPr>
+                    <a:xfrm>
+                      <a:off x="0" y="0"/>
+                      <a:ext cx="5806440" cy="2903220"/>
+                    </a:xfrm>
+                    <a:prstGeom prst="rect"/>
+                  </pic:spPr>
+                </pic:pic>
+              </a:graphicData>
+            </a:graphic>
+          </wp:inline>
+        </w:drawing>
+      </w:r>
+    </w:p>
+    <w:p>
+      <w:pPr>
         <w:rPr>
           <w:rFonts w:ascii="Times New Roman" w:hAnsi="Times New Roman" w:cs="Times New Roman"/>
         </w:rPr>
@@ -8688,6 +9328,70 @@
           <w:sz w:val="14"/>
         </w:rPr>
         <w:t>Result: 7</w:t>
+      </w:r>
+    </w:p>
+    <w:p>
+      <w:pPr>
+        <w:pStyle w:val="NoSpacing"/>
+        <w:spacing w:before="0" w:after="0" w:line="240" w:lineRule="auto"/>
+        <w:ind w:left="0" w:firstLine="0"/>
+      </w:pPr>
+    </w:p>
+    <w:p>
+      <w:pPr>
+        <w:pStyle w:val="NoSpacing"/>
+        <w:spacing w:before="60" w:after="40" w:line="240" w:lineRule="auto"/>
+        <w:ind w:left="0" w:firstLine="0"/>
+      </w:pPr>
+      <w:r>
+        <w:rPr>
+          <w:rFonts w:ascii="Calibri" w:hAnsi="Calibri" w:cs="Calibri" w:eastAsia="Calibri"/>
+          <w:b/>
+          <w:sz w:val="18"/>
+        </w:rPr>
+        <w:t>VS Code - run in the integrated terminal (see the command and its output):</w:t>
+      </w:r>
+    </w:p>
+    <w:p>
+      <w:pPr>
+        <w:pStyle w:val="NoSpacing"/>
+        <w:spacing w:before="0" w:after="0" w:line="240" w:lineRule="auto"/>
+        <w:ind w:left="0" w:firstLine="0"/>
+        <w:jc w:val="left"/>
+      </w:pPr>
+      <w:r>
+        <w:drawing>
+          <wp:inline xmlns:a="http://schemas.openxmlformats.org/drawingml/2006/main" xmlns:pic="http://schemas.openxmlformats.org/drawingml/2006/picture">
+            <wp:extent cx="5806440" cy="2903220"/>
+            <wp:docPr id="1376574532" name="Picture 1376574532"/>
+            <wp:cNvGraphicFramePr>
+              <a:graphicFrameLocks noChangeAspect="1"/>
+            </wp:cNvGraphicFramePr>
+            <a:graphic>
+              <a:graphicData uri="http://schemas.openxmlformats.org/drawingml/2006/picture">
+                <pic:pic>
+                  <pic:nvPicPr>
+                    <pic:cNvPr id="0" name="11_NumberToLetter.png"/>
+                    <pic:cNvPicPr/>
+                  </pic:nvPicPr>
+                  <pic:blipFill>
+                    <a:blip r:embed="rId22"/>
+                    <a:stretch>
+                      <a:fillRect/>
+                    </a:stretch>
+                  </pic:blipFill>
+                  <pic:spPr>
+                    <a:xfrm>
+                      <a:off x="0" y="0"/>
+                      <a:ext cx="5806440" cy="2903220"/>
+                    </a:xfrm>
+                    <a:prstGeom prst="rect"/>
+                  </pic:spPr>
+                </pic:pic>
+              </a:graphicData>
+            </a:graphic>
+          </wp:inline>
+        </w:drawing>
       </w:r>
     </w:p>
     <w:p>
@@ -9156,7 +9860,71 @@
           <w:p>
             <w:pPr>
               <w:pStyle w:val="NoSpacing"/>
-              <w:spacing w:before="160" w:after="40" w:line="240" w:lineRule="auto"/>
+              <w:spacing w:before="0" w:after="0" w:line="240" w:lineRule="auto"/>
+              <w:ind w:left="0" w:firstLine="0"/>
+            </w:pPr>
+          </w:p>
+          <w:p>
+            <w:pPr>
+              <w:pStyle w:val="NoSpacing"/>
+              <w:spacing w:before="60" w:after="40" w:line="240" w:lineRule="auto"/>
+              <w:ind w:left="0" w:firstLine="0"/>
+            </w:pPr>
+            <w:r>
+              <w:rPr>
+                <w:rFonts w:ascii="Calibri" w:hAnsi="Calibri" w:cs="Calibri" w:eastAsia="Calibri"/>
+                <w:b/>
+                <w:sz w:val="18"/>
+              </w:rPr>
+              <w:t>VS Code - run in the integrated terminal (see the command and its output):</w:t>
+            </w:r>
+          </w:p>
+          <w:p>
+            <w:pPr>
+              <w:pStyle w:val="NoSpacing"/>
+              <w:spacing w:before="0" w:after="0" w:line="240" w:lineRule="auto"/>
+              <w:ind w:left="0" w:firstLine="0"/>
+              <w:jc w:val="left"/>
+            </w:pPr>
+            <w:r>
+              <w:drawing>
+                <wp:inline xmlns:a="http://schemas.openxmlformats.org/drawingml/2006/main" xmlns:pic="http://schemas.openxmlformats.org/drawingml/2006/picture">
+                  <wp:extent cx="5806440" cy="2903220"/>
+                  <wp:docPr id="1376574533" name="Picture 1376574533"/>
+                  <wp:cNvGraphicFramePr>
+                    <a:graphicFrameLocks noChangeAspect="1"/>
+                  </wp:cNvGraphicFramePr>
+                  <a:graphic>
+                    <a:graphicData uri="http://schemas.openxmlformats.org/drawingml/2006/picture">
+                      <pic:pic>
+                        <pic:nvPicPr>
+                          <pic:cNvPr id="0" name="12a_SumOfSquares.png"/>
+                          <pic:cNvPicPr/>
+                        </pic:nvPicPr>
+                        <pic:blipFill>
+                          <a:blip r:embed="rId23"/>
+                          <a:stretch>
+                            <a:fillRect/>
+                          </a:stretch>
+                        </pic:blipFill>
+                        <pic:spPr>
+                          <a:xfrm>
+                            <a:off x="0" y="0"/>
+                            <a:ext cx="5806440" cy="2903220"/>
+                          </a:xfrm>
+                          <a:prstGeom prst="rect"/>
+                        </pic:spPr>
+                      </pic:pic>
+                    </a:graphicData>
+                  </a:graphic>
+                </wp:inline>
+              </w:drawing>
+            </w:r>
+          </w:p>
+          <w:p>
+            <w:pPr>
+              <w:pStyle w:val="NoSpacing"/>
+              <w:spacing w:before="40" w:after="40" w:line="240" w:lineRule="auto"/>
               <w:ind w:left="0" w:firstLine="0"/>
             </w:pPr>
             <w:r>
@@ -9604,6 +10372,70 @@
           </w:p>
           <w:p>
             <w:pPr>
+              <w:pStyle w:val="NoSpacing"/>
+              <w:spacing w:before="0" w:after="0" w:line="240" w:lineRule="auto"/>
+              <w:ind w:left="0" w:firstLine="0"/>
+            </w:pPr>
+          </w:p>
+          <w:p>
+            <w:pPr>
+              <w:pStyle w:val="NoSpacing"/>
+              <w:spacing w:before="60" w:after="40" w:line="240" w:lineRule="auto"/>
+              <w:ind w:left="0" w:firstLine="0"/>
+            </w:pPr>
+            <w:r>
+              <w:rPr>
+                <w:rFonts w:ascii="Calibri" w:hAnsi="Calibri" w:cs="Calibri" w:eastAsia="Calibri"/>
+                <w:b/>
+                <w:sz w:val="18"/>
+              </w:rPr>
+              <w:t>VS Code - run in the integrated terminal (see the command and its output):</w:t>
+            </w:r>
+          </w:p>
+          <w:p>
+            <w:pPr>
+              <w:pStyle w:val="NoSpacing"/>
+              <w:spacing w:before="0" w:after="0" w:line="240" w:lineRule="auto"/>
+              <w:ind w:left="0" w:firstLine="0"/>
+              <w:jc w:val="left"/>
+            </w:pPr>
+            <w:r>
+              <w:drawing>
+                <wp:inline xmlns:a="http://schemas.openxmlformats.org/drawingml/2006/main" xmlns:pic="http://schemas.openxmlformats.org/drawingml/2006/picture">
+                  <wp:extent cx="5806440" cy="2903220"/>
+                  <wp:docPr id="1376574534" name="Picture 1376574534"/>
+                  <wp:cNvGraphicFramePr>
+                    <a:graphicFrameLocks noChangeAspect="1"/>
+                  </wp:cNvGraphicFramePr>
+                  <a:graphic>
+                    <a:graphicData uri="http://schemas.openxmlformats.org/drawingml/2006/picture">
+                      <pic:pic>
+                        <pic:nvPicPr>
+                          <pic:cNvPr id="0" name="12b_PerfectSquares.png"/>
+                          <pic:cNvPicPr/>
+                        </pic:nvPicPr>
+                        <pic:blipFill>
+                          <a:blip r:embed="rId24"/>
+                          <a:stretch>
+                            <a:fillRect/>
+                          </a:stretch>
+                        </pic:blipFill>
+                        <pic:spPr>
+                          <a:xfrm>
+                            <a:off x="0" y="0"/>
+                            <a:ext cx="5806440" cy="2903220"/>
+                          </a:xfrm>
+                          <a:prstGeom prst="rect"/>
+                        </pic:spPr>
+                      </pic:pic>
+                    </a:graphicData>
+                  </a:graphic>
+                </wp:inline>
+              </w:drawing>
+            </w:r>
+          </w:p>
+          <w:p>
+            <w:pPr>
               <w:keepNext/>
               <w:spacing w:after="0" w:line="240" w:lineRule="auto"/>
               <w:rPr>
@@ -11214,6 +12046,70 @@
           <w:sz w:val="14"/>
         </w:rPr>
         <w:t>-------------------------------------</w:t>
+      </w:r>
+    </w:p>
+    <w:p>
+      <w:pPr>
+        <w:pStyle w:val="NoSpacing"/>
+        <w:spacing w:before="0" w:after="0" w:line="240" w:lineRule="auto"/>
+        <w:ind w:left="0" w:firstLine="0"/>
+      </w:pPr>
+    </w:p>
+    <w:p>
+      <w:pPr>
+        <w:pStyle w:val="NoSpacing"/>
+        <w:spacing w:before="60" w:after="40" w:line="240" w:lineRule="auto"/>
+        <w:ind w:left="0" w:firstLine="0"/>
+      </w:pPr>
+      <w:r>
+        <w:rPr>
+          <w:rFonts w:ascii="Calibri" w:hAnsi="Calibri" w:cs="Calibri" w:eastAsia="Calibri"/>
+          <w:b/>
+          <w:sz w:val="18"/>
+        </w:rPr>
+        <w:t>VS Code - run in the integrated terminal (see the command and its output):</w:t>
+      </w:r>
+    </w:p>
+    <w:p>
+      <w:pPr>
+        <w:pStyle w:val="NoSpacing"/>
+        <w:spacing w:before="0" w:after="0" w:line="240" w:lineRule="auto"/>
+        <w:ind w:left="0" w:firstLine="0"/>
+        <w:jc w:val="left"/>
+      </w:pPr>
+      <w:r>
+        <w:drawing>
+          <wp:inline xmlns:a="http://schemas.openxmlformats.org/drawingml/2006/main" xmlns:pic="http://schemas.openxmlformats.org/drawingml/2006/picture">
+            <wp:extent cx="5806440" cy="2903220"/>
+            <wp:docPr id="1376574535" name="Picture 1376574535"/>
+            <wp:cNvGraphicFramePr>
+              <a:graphicFrameLocks noChangeAspect="1"/>
+            </wp:cNvGraphicFramePr>
+            <a:graphic>
+              <a:graphicData uri="http://schemas.openxmlformats.org/drawingml/2006/picture">
+                <pic:pic>
+                  <pic:nvPicPr>
+                    <pic:cNvPr id="0" name="13_FramingCost.png"/>
+                    <pic:cNvPicPr/>
+                  </pic:nvPicPr>
+                  <pic:blipFill>
+                    <a:blip r:embed="rId25"/>
+                    <a:stretch>
+                      <a:fillRect/>
+                    </a:stretch>
+                  </pic:blipFill>
+                  <pic:spPr>
+                    <a:xfrm>
+                      <a:off x="0" y="0"/>
+                      <a:ext cx="5806440" cy="2903220"/>
+                    </a:xfrm>
+                    <a:prstGeom prst="rect"/>
+                  </pic:spPr>
+                </pic:pic>
+              </a:graphicData>
+            </a:graphic>
+          </wp:inline>
+        </w:drawing>
       </w:r>
     </w:p>
     <w:p>

</xml_diff>

<commit_message>
Workshop 3: full-screen VS Code screenshots (1920x1080) for all 14 exercises
</commit_message>
<xml_diff>
--- a/JavaProjects/Week03-Workshop3/doc/BIT235_Workshop3_S1580887.docx
+++ b/JavaProjects/Week03-Workshop3/doc/BIT235_Workshop3_S1580887.docx
@@ -898,7 +898,7 @@
       <w:r>
         <w:drawing>
           <wp:inline xmlns:a="http://schemas.openxmlformats.org/drawingml/2006/main" xmlns:pic="http://schemas.openxmlformats.org/drawingml/2006/picture">
-            <wp:extent cx="5806440" cy="4645152"/>
+            <wp:extent cx="5806440" cy="3289717"/>
             <wp:docPr id="1376574522" name="Picture 1376574522"/>
             <wp:cNvGraphicFramePr>
               <a:graphicFrameLocks noChangeAspect="1"/>
@@ -919,7 +919,7 @@
                   <pic:spPr>
                     <a:xfrm>
                       <a:off x="0" y="0"/>
-                      <a:ext cx="5806440" cy="4645152"/>
+                      <a:ext cx="5806440" cy="3289717"/>
                     </a:xfrm>
                     <a:prstGeom prst="rect"/>
                   </pic:spPr>
@@ -1421,7 +1421,7 @@
       <w:r>
         <w:drawing>
           <wp:inline xmlns:a="http://schemas.openxmlformats.org/drawingml/2006/main" xmlns:pic="http://schemas.openxmlformats.org/drawingml/2006/picture">
-            <wp:extent cx="5806440" cy="4645152"/>
+            <wp:extent cx="5806440" cy="3289717"/>
             <wp:docPr id="1376574523" name="Picture 1376574523"/>
             <wp:cNvGraphicFramePr>
               <a:graphicFrameLocks noChangeAspect="1"/>
@@ -1442,7 +1442,7 @@
                   <pic:spPr>
                     <a:xfrm>
                       <a:off x="0" y="0"/>
-                      <a:ext cx="5806440" cy="4645152"/>
+                      <a:ext cx="5806440" cy="3289717"/>
                     </a:xfrm>
                     <a:prstGeom prst="rect"/>
                   </pic:spPr>
@@ -2747,7 +2747,7 @@
       <w:r>
         <w:drawing>
           <wp:inline xmlns:a="http://schemas.openxmlformats.org/drawingml/2006/main" xmlns:pic="http://schemas.openxmlformats.org/drawingml/2006/picture">
-            <wp:extent cx="5806440" cy="4645152"/>
+            <wp:extent cx="5806440" cy="3289717"/>
             <wp:docPr id="1376574524" name="Picture 1376574524"/>
             <wp:cNvGraphicFramePr>
               <a:graphicFrameLocks noChangeAspect="1"/>
@@ -2768,7 +2768,7 @@
                   <pic:spPr>
                     <a:xfrm>
                       <a:off x="0" y="0"/>
-                      <a:ext cx="5806440" cy="4645152"/>
+                      <a:ext cx="5806440" cy="3289717"/>
                     </a:xfrm>
                     <a:prstGeom prst="rect"/>
                   </pic:spPr>
@@ -4044,7 +4044,7 @@
       <w:r>
         <w:drawing>
           <wp:inline xmlns:a="http://schemas.openxmlformats.org/drawingml/2006/main" xmlns:pic="http://schemas.openxmlformats.org/drawingml/2006/picture">
-            <wp:extent cx="5806440" cy="4645152"/>
+            <wp:extent cx="5806440" cy="3289717"/>
             <wp:docPr id="1376574525" name="Picture 1376574525"/>
             <wp:cNvGraphicFramePr>
               <a:graphicFrameLocks noChangeAspect="1"/>
@@ -4065,7 +4065,7 @@
                   <pic:spPr>
                     <a:xfrm>
                       <a:off x="0" y="0"/>
-                      <a:ext cx="5806440" cy="4645152"/>
+                      <a:ext cx="5806440" cy="3289717"/>
                     </a:xfrm>
                     <a:prstGeom prst="rect"/>
                   </pic:spPr>
@@ -5344,7 +5344,7 @@
       <w:r>
         <w:drawing>
           <wp:inline xmlns:a="http://schemas.openxmlformats.org/drawingml/2006/main" xmlns:pic="http://schemas.openxmlformats.org/drawingml/2006/picture">
-            <wp:extent cx="5806440" cy="4645152"/>
+            <wp:extent cx="5806440" cy="3289717"/>
             <wp:docPr id="1376574526" name="Picture 1376574526"/>
             <wp:cNvGraphicFramePr>
               <a:graphicFrameLocks noChangeAspect="1"/>
@@ -5365,7 +5365,7 @@
                   <pic:spPr>
                     <a:xfrm>
                       <a:off x="0" y="0"/>
-                      <a:ext cx="5806440" cy="4645152"/>
+                      <a:ext cx="5806440" cy="3289717"/>
                     </a:xfrm>
                     <a:prstGeom prst="rect"/>
                   </pic:spPr>
@@ -6007,7 +6007,7 @@
       <w:r>
         <w:drawing>
           <wp:inline xmlns:a="http://schemas.openxmlformats.org/drawingml/2006/main" xmlns:pic="http://schemas.openxmlformats.org/drawingml/2006/picture">
-            <wp:extent cx="5806440" cy="4645152"/>
+            <wp:extent cx="5806440" cy="3289717"/>
             <wp:docPr id="1376574527" name="Picture 1376574527"/>
             <wp:cNvGraphicFramePr>
               <a:graphicFrameLocks noChangeAspect="1"/>
@@ -6028,7 +6028,7 @@
                   <pic:spPr>
                     <a:xfrm>
                       <a:off x="0" y="0"/>
-                      <a:ext cx="5806440" cy="4645152"/>
+                      <a:ext cx="5806440" cy="3289717"/>
                     </a:xfrm>
                     <a:prstGeom prst="rect"/>
                   </pic:spPr>
@@ -6654,7 +6654,7 @@
       <w:r>
         <w:drawing>
           <wp:inline xmlns:a="http://schemas.openxmlformats.org/drawingml/2006/main" xmlns:pic="http://schemas.openxmlformats.org/drawingml/2006/picture">
-            <wp:extent cx="5806440" cy="4645152"/>
+            <wp:extent cx="5806440" cy="3289717"/>
             <wp:docPr id="1376574528" name="Picture 1376574528"/>
             <wp:cNvGraphicFramePr>
               <a:graphicFrameLocks noChangeAspect="1"/>
@@ -6675,7 +6675,7 @@
                   <pic:spPr>
                     <a:xfrm>
                       <a:off x="0" y="0"/>
-                      <a:ext cx="5806440" cy="4645152"/>
+                      <a:ext cx="5806440" cy="3289717"/>
                     </a:xfrm>
                     <a:prstGeom prst="rect"/>
                   </pic:spPr>
@@ -7165,7 +7165,7 @@
       <w:r>
         <w:drawing>
           <wp:inline xmlns:a="http://schemas.openxmlformats.org/drawingml/2006/main" xmlns:pic="http://schemas.openxmlformats.org/drawingml/2006/picture">
-            <wp:extent cx="5806440" cy="4645152"/>
+            <wp:extent cx="5806440" cy="3289717"/>
             <wp:docPr id="1376574529" name="Picture 1376574529"/>
             <wp:cNvGraphicFramePr>
               <a:graphicFrameLocks noChangeAspect="1"/>
@@ -7186,7 +7186,7 @@
                   <pic:spPr>
                     <a:xfrm>
                       <a:off x="0" y="0"/>
-                      <a:ext cx="5806440" cy="4645152"/>
+                      <a:ext cx="5806440" cy="3289717"/>
                     </a:xfrm>
                     <a:prstGeom prst="rect"/>
                   </pic:spPr>
@@ -7542,7 +7542,7 @@
       <w:r>
         <w:drawing>
           <wp:inline xmlns:a="http://schemas.openxmlformats.org/drawingml/2006/main" xmlns:pic="http://schemas.openxmlformats.org/drawingml/2006/picture">
-            <wp:extent cx="5806440" cy="4645152"/>
+            <wp:extent cx="5806440" cy="3289717"/>
             <wp:docPr id="1376574530" name="Picture 1376574530"/>
             <wp:cNvGraphicFramePr>
               <a:graphicFrameLocks noChangeAspect="1"/>
@@ -7563,7 +7563,7 @@
                   <pic:spPr>
                     <a:xfrm>
                       <a:off x="0" y="0"/>
-                      <a:ext cx="5806440" cy="4645152"/>
+                      <a:ext cx="5806440" cy="3289717"/>
                     </a:xfrm>
                     <a:prstGeom prst="rect"/>
                   </pic:spPr>
@@ -7948,7 +7948,7 @@
       <w:r>
         <w:drawing>
           <wp:inline xmlns:a="http://schemas.openxmlformats.org/drawingml/2006/main" xmlns:pic="http://schemas.openxmlformats.org/drawingml/2006/picture">
-            <wp:extent cx="5806440" cy="4645152"/>
+            <wp:extent cx="5806440" cy="3289717"/>
             <wp:docPr id="1376574531" name="Picture 1376574531"/>
             <wp:cNvGraphicFramePr>
               <a:graphicFrameLocks noChangeAspect="1"/>
@@ -7969,7 +7969,7 @@
                   <pic:spPr>
                     <a:xfrm>
                       <a:off x="0" y="0"/>
-                      <a:ext cx="5806440" cy="4645152"/>
+                      <a:ext cx="5806440" cy="3289717"/>
                     </a:xfrm>
                     <a:prstGeom prst="rect"/>
                   </pic:spPr>
@@ -8863,7 +8863,7 @@
       <w:r>
         <w:drawing>
           <wp:inline xmlns:a="http://schemas.openxmlformats.org/drawingml/2006/main" xmlns:pic="http://schemas.openxmlformats.org/drawingml/2006/picture">
-            <wp:extent cx="5806440" cy="4645152"/>
+            <wp:extent cx="5806440" cy="3289717"/>
             <wp:docPr id="1376574532" name="Picture 1376574532"/>
             <wp:cNvGraphicFramePr>
               <a:graphicFrameLocks noChangeAspect="1"/>
@@ -8884,7 +8884,7 @@
                   <pic:spPr>
                     <a:xfrm>
                       <a:off x="0" y="0"/>
-                      <a:ext cx="5806440" cy="4645152"/>
+                      <a:ext cx="5806440" cy="3289717"/>
                     </a:xfrm>
                     <a:prstGeom prst="rect"/>
                   </pic:spPr>
@@ -9576,7 +9576,7 @@
             <w:r>
               <w:drawing>
                 <wp:inline xmlns:a="http://schemas.openxmlformats.org/drawingml/2006/main" xmlns:pic="http://schemas.openxmlformats.org/drawingml/2006/picture">
-                  <wp:extent cx="5806440" cy="4645152"/>
+                  <wp:extent cx="5806440" cy="3289717"/>
                   <wp:docPr id="1376574533" name="Picture 1376574533"/>
                   <wp:cNvGraphicFramePr>
                     <a:graphicFrameLocks noChangeAspect="1"/>
@@ -9597,7 +9597,7 @@
                         <pic:spPr>
                           <a:xfrm>
                             <a:off x="0" y="0"/>
-                            <a:ext cx="5806440" cy="4645152"/>
+                            <a:ext cx="5806440" cy="3289717"/>
                           </a:xfrm>
                           <a:prstGeom prst="rect"/>
                         </pic:spPr>
@@ -9946,7 +9946,7 @@
             <w:r>
               <w:drawing>
                 <wp:inline xmlns:a="http://schemas.openxmlformats.org/drawingml/2006/main" xmlns:pic="http://schemas.openxmlformats.org/drawingml/2006/picture">
-                  <wp:extent cx="5806440" cy="4645152"/>
+                  <wp:extent cx="5806440" cy="3289717"/>
                   <wp:docPr id="1376574534" name="Picture 1376574534"/>
                   <wp:cNvGraphicFramePr>
                     <a:graphicFrameLocks noChangeAspect="1"/>
@@ -9967,7 +9967,7 @@
                         <pic:spPr>
                           <a:xfrm>
                             <a:off x="0" y="0"/>
-                            <a:ext cx="5806440" cy="4645152"/>
+                            <a:ext cx="5806440" cy="3289717"/>
                           </a:xfrm>
                           <a:prstGeom prst="rect"/>
                         </pic:spPr>
@@ -10654,7 +10654,7 @@
       <w:r>
         <w:drawing>
           <wp:inline xmlns:a="http://schemas.openxmlformats.org/drawingml/2006/main" xmlns:pic="http://schemas.openxmlformats.org/drawingml/2006/picture">
-            <wp:extent cx="5806440" cy="4645152"/>
+            <wp:extent cx="5806440" cy="3289717"/>
             <wp:docPr id="1376574535" name="Picture 1376574535"/>
             <wp:cNvGraphicFramePr>
               <a:graphicFrameLocks noChangeAspect="1"/>
@@ -10675,7 +10675,7 @@
                   <pic:spPr>
                     <a:xfrm>
                       <a:off x="0" y="0"/>
-                      <a:ext cx="5806440" cy="4645152"/>
+                      <a:ext cx="5806440" cy="3289717"/>
                     </a:xfrm>
                     <a:prstGeom prst="rect"/>
                   </pic:spPr>

</xml_diff>